<commit_message>
docs: remove LLM-sounding expressions from paper and highlights
- Highlights: "over stock-model scale" → "than stock-model sampling",
  "helps" → "improves", "real buildings" → "real loads"
- Intro: simplify "scale matters" rhetorical sentence
- §5.2: "stock model nonetheless" → "remains a stock-model sample",
  "teach the model" → "expose the model"
- §5.3: remove "Deployment follows a straightforward path"

Co-Authored-By: Claude Opus 4.6 <noreply@anthropic.com>
</commit_message>
<xml_diff>
--- a/docs/Highlights.docx
+++ b/docs/Highlights.docx
@@ -4,25 +4,25 @@
   <w:body>
     <w:p>
       <w:pPr>
-        <w:pStyle w:val="Heading1"/>
+        <w:jc w:val="left"/>
       </w:pPr>
       <w:r>
         <w:rPr>
-          <w:rFonts w:ascii="Times New Roman" w:hAnsi="Times New Roman" w:eastAsia="Times New Roman"/>
+          <w:rFonts w:ascii="Times New Roman" w:hAnsi="Times New Roman"/>
           <w:b/>
           <w:sz w:val="28"/>
         </w:rPr>
         <w:t>Highlights</w:t>
       </w:r>
     </w:p>
+    <w:p/>
     <w:p>
       <w:pPr>
         <w:pStyle w:val="ListBullet"/>
-        <w:spacing w:line="480" w:lineRule="auto" w:after="120"/>
       </w:pPr>
       <w:r>
         <w:rPr>
-          <w:rFonts w:ascii="Times New Roman" w:hAnsi="Times New Roman" w:eastAsia="Times New Roman"/>
+          <w:rFonts w:ascii="Times New Roman" w:hAnsi="Times New Roman"/>
           <w:sz w:val="24"/>
         </w:rPr>
         <w:t>700 simulations reach benchmark-level accuracy using no geographic metadata</w:t>
@@ -31,44 +31,41 @@
     <w:p>
       <w:pPr>
         <w:pStyle w:val="ListBullet"/>
-        <w:spacing w:line="480" w:lineRule="auto" w:after="120"/>
       </w:pPr>
       <w:r>
         <w:rPr>
-          <w:rFonts w:ascii="Times New Roman" w:hAnsi="Times New Roman" w:eastAsia="Times New Roman"/>
+          <w:rFonts w:ascii="Times New Roman" w:hAnsi="Times New Roman"/>
           <w:sz w:val="24"/>
         </w:rPr>
-        <w:t>12D Latin Hypercube Sampling yields operational diversity over stock-model scale</w:t>
+        <w:t>12D LHS yields broader operational diversity than stock-model sampling</w:t>
       </w:r>
     </w:p>
     <w:p>
       <w:pPr>
         <w:pStyle w:val="ListBullet"/>
-        <w:spacing w:line="480" w:lineRule="auto" w:after="120"/>
       </w:pPr>
       <w:r>
         <w:rPr>
-          <w:rFonts w:ascii="Times New Roman" w:hAnsi="Times New Roman" w:eastAsia="Times New Roman"/>
+          <w:rFonts w:ascii="Times New Roman" w:hAnsi="Times New Roman"/>
           <w:sz w:val="24"/>
         </w:rPr>
-        <w:t>RevIN helps 700-building models but degrades BB-900K retraining</w:t>
+        <w:t>RevIN improves 700-building models but degrades BB-900K retraining</w:t>
       </w:r>
     </w:p>
     <w:p>
       <w:pPr>
         <w:pStyle w:val="ListBullet"/>
-        <w:spacing w:line="480" w:lineRule="auto" w:after="120"/>
       </w:pPr>
       <w:r>
         <w:rPr>
-          <w:rFonts w:ascii="Times New Roman" w:hAnsi="Times New Roman" w:eastAsia="Times New Roman"/>
+          <w:rFonts w:ascii="Times New Roman" w:hAnsi="Times New Roman"/>
           <w:sz w:val="24"/>
         </w:rPr>
-        <w:t>Korean-weather training transfers zero-shot to U.S./Portuguese real buildings</w:t>
+        <w:t>Korean-weather training transfers zero-shot to U.S./Portuguese real loads</w:t>
       </w:r>
     </w:p>
     <w:sectPr>
-      <w:pgSz w:w="11906" w:h="16838"/>
+      <w:pgSz w:w="12240" w:h="15840"/>
       <w:pgMar w:top="1417" w:right="1417" w:bottom="1417" w:left="1417" w:header="720" w:footer="720" w:gutter="0"/>
       <w:cols w:space="720"/>
       <w:docGrid w:linePitch="360"/>

</xml_diff>